<commit_message>
some issues are solved
</commit_message>
<xml_diff>
--- a/Practical-Submission-Format.docx
+++ b/Practical-Submission-Format.docx
@@ -46,14 +46,6 @@
           <w:sz w:val="24"/>
           <w:lang w:val="en-GB"/>
         </w:rPr>
-      </w:r>
-      <w:r>
-        <w:rPr>
-          <w:b w:val="0"/>
-          <w:bCs w:val="0"/>
-          <w:sz w:val="24"/>
-          <w:lang w:val="en-GB"/>
-        </w:rPr>
         <w:t xml:space="preserve">.</w:t>
       </w:r>
       <w:r>
@@ -128,9 +120,9 @@
       </w:r>
       <w:r>
         <w:rPr>
-          <w:b/>
+          <w:b w:val="0"/>
+          <w:bCs w:val="0"/>
           <w:sz w:val="24"/>
-          <w:lang w:val="en-GB"/>
         </w:rPr>
       </w:r>
       <w:r>
@@ -144,8 +136,12 @@
     <w:p>
       <w:pPr>
         <w:pBdr/>
+        <w:tabs>
+          <w:tab w:val="left" w:leader="none" w:pos="2807"/>
+        </w:tabs>
         <w:spacing w:line="600" w:lineRule="auto"/>
         <w:ind/>
+        <w:jc w:val="left"/>
         <w:rPr>
           <w:b/>
           <w:sz w:val="24"/>
@@ -168,6 +164,13 @@
           <w:b/>
           <w:sz w:val="24"/>
         </w:rPr>
+        <w:tab/>
+      </w:r>
+      <w:r>
+        <w:rPr>
+          <w:b/>
+          <w:sz w:val="24"/>
+        </w:rPr>
       </w:r>
     </w:p>
     <w:p>
@@ -197,35 +200,9 @@
       </w:r>
       <w:r>
         <w:rPr>
-          <w:b/>
-          <w:sz w:val="24"/>
-        </w:rPr>
-      </w:r>
-      <w:r>
-        <w:rPr>
           <w:sz w:val="24"/>
           <w:szCs w:val="24"/>
           <w:highlight w:val="none"/>
-        </w:rPr>
-      </w:r>
-      <w:r>
-        <w:rPr>
-          <w:sz w:val="24"/>
-          <w:highlight w:val="none"/>
-        </w:rPr>
-      </w:r>
-      <w:r>
-        <w:rPr>
-          <w:sz w:val="24"/>
-          <w:highlight w:val="none"/>
-        </w:rPr>
-      </w:r>
-      <w:r>
-        <w:rPr>
-          <w:b/>
-          <w:bCs/>
-          <w:sz w:val="24"/>
-          <w:szCs w:val="24"/>
         </w:rPr>
       </w:r>
       <w:r>
@@ -282,6 +259,8 @@
       <w:r>
         <w:rPr>
           <w:sz w:val="24"/>
+          <w:szCs w:val="24"/>
+          <w:highlight w:val="none"/>
         </w:rPr>
       </w:r>
       <w:r>
@@ -318,9 +297,8 @@
       </w:r>
       <w:r>
         <w:rPr>
-          <w:b/>
           <w:sz w:val="24"/>
-          <w:highlight w:val="none"/>
+          <w:szCs w:val="24"/>
         </w:rPr>
       </w:r>
     </w:p>
@@ -351,7 +329,11 @@
       </w:r>
       <w:r>
         <w:rPr>
+          <w:b/>
+          <w:bCs/>
           <w:sz w:val="24"/>
+          <w:szCs w:val="24"/>
+          <w:highlight w:val="none"/>
         </w:rPr>
       </w:r>
     </w:p>
@@ -401,33 +383,8 @@
       <w:r>
         <w:rPr>
           <w:sz w:val="24"/>
-        </w:rPr>
-      </w:r>
-      <w:r/>
-      <w:r/>
-      <w:r>
-        <w:rPr>
-          <w:sz w:val="24"/>
           <w:szCs w:val="24"/>
           <w:highlight w:val="none"/>
-        </w:rPr>
-      </w:r>
-      <w:r>
-        <w:rPr>
-          <w:sz w:val="24"/>
-          <w:highlight w:val="none"/>
-        </w:rPr>
-      </w:r>
-      <w:r>
-        <w:rPr>
-          <w:sz w:val="24"/>
-          <w:highlight w:val="none"/>
-        </w:rPr>
-      </w:r>
-      <w:r>
-        <w:rPr>
-          <w:sz w:val="24"/>
-          <w:szCs w:val="24"/>
         </w:rPr>
       </w:r>
       <w:r>

</xml_diff>